<commit_message>
Rework the walkthrough: lesson-and-fix slide, plain-English subtitles, higher contrast
</commit_message>
<xml_diff>
--- a/docs/demo/AUDIT_REPORT.docx
+++ b/docs/demo/AUDIT_REPORT.docx
@@ -246,7 +246,7 @@
                 <w:i w:val="0"/>
                 <w:sz w:val="18"/>
               </w:rPr>
-              <w:t xml:space="preserve"> · 86.0 s · 1920x1080 · 30 fps · silent</w:t>
+              <w:t xml:space="preserve"> · 88.4 s · 1920x1080 · 30 fps · silent</w:t>
             </w:r>
           </w:p>
         </w:tc>
@@ -288,7 +288,7 @@
                 <w:i w:val="0"/>
                 <w:sz w:val="18"/>
               </w:rPr>
-              <w:t>2026-10-14 14:13</w:t>
+              <w:t>2026-10-14 18:36</w:t>
             </w:r>
           </w:p>
         </w:tc>
@@ -328,7 +328,7 @@
                 <w:i w:val="0"/>
                 <w:sz w:val="18"/>
               </w:rPr>
-              <w:t>58 pass · 0 fail · 1 manual (of 59 figures)</w:t>
+              <w:t>61 pass · 0 fail · 1 manual (of 62 figures)</w:t>
             </w:r>
           </w:p>
         </w:tc>
@@ -3014,7 +3014,7 @@
                 <w:i w:val="0"/>
                 <w:sz w:val="14"/>
               </w:rPr>
-              <w:t>04</w:t>
+              <w:t>04, 09</w:t>
             </w:r>
           </w:p>
         </w:tc>
@@ -3153,7 +3153,7 @@
                 <w:i w:val="0"/>
                 <w:sz w:val="14"/>
               </w:rPr>
-              <w:t>91.3%</w:t>
+              <w:t>91.3% (slide 09 panel and payoff strip)</w:t>
             </w:r>
           </w:p>
         </w:tc>
@@ -3173,7 +3173,7 @@
                 <w:i w:val="0"/>
                 <w:sz w:val="14"/>
               </w:rPr>
-              <w:t>04</w:t>
+              <w:t>04, 09</w:t>
             </w:r>
           </w:p>
         </w:tc>
@@ -6353,7 +6353,7 @@
                 <w:i w:val="0"/>
                 <w:sz w:val="14"/>
               </w:rPr>
-              <w:t>9 bars</w:t>
+              <w:t>9 bars with plain names</w:t>
             </w:r>
           </w:p>
         </w:tc>
@@ -6394,7 +6394,7 @@
                 <w:i w:val="0"/>
                 <w:sz w:val="11"/>
               </w:rPr>
-              <w:t>outputs/metrics.json</w:t>
+              <w:t>outputs/metrics.json; src/pipeline_builder/datagen.py:515-569</w:t>
             </w:r>
           </w:p>
         </w:tc>
@@ -6434,7 +6434,7 @@
                 <w:i w:val="0"/>
                 <w:sz w:val="14"/>
               </w:rPr>
-              <w:t>-</w:t>
+              <w:t>on-screen names: duplicate_row = Duplicate row, null_required = Missing required value, orphan_fk = ID with no match, type_corruption = Text in a number field, negative_value = Negative amount, future_date = Date in the future, malformed_email = Broken email, invalid_enum = Status or method typo (orders.status, payments.method), outlier_value = Price inflated 100x (order_items.unit_price x 100)</w:t>
             </w:r>
           </w:p>
         </w:tc>
@@ -6673,7 +6673,7 @@
                 <w:i w:val="0"/>
                 <w:sz w:val="14"/>
               </w:rPr>
-              <w:t>100% for duplicate_row and null_required, 0% for the other seven</w:t>
+              <w:t>100% for Duplicate row and Missing required value, 0% for the other seven</w:t>
             </w:r>
           </w:p>
         </w:tc>
@@ -8115,7 +8115,7 @@
                 <w:i w:val="0"/>
                 <w:sz w:val="14"/>
               </w:rPr>
-              <w:t>pandas 68.5% · DuckDB 81.5%</w:t>
+              <w:t>plain pandas read: 68.5% / plain DuckDB read: 81.5%</w:t>
             </w:r>
           </w:p>
         </w:tc>
@@ -8273,7 +8273,7 @@
                 <w:i w:val="0"/>
                 <w:sz w:val="14"/>
               </w:rPr>
-              <w:t>hand-written pass: 29.5%</w:t>
+              <w:t>hand-written checks / catch 29.5%</w:t>
             </w:r>
           </w:p>
         </w:tc>
@@ -8593,7 +8593,7 @@
                 <w:i w:val="0"/>
                 <w:sz w:val="14"/>
               </w:rPr>
-              <w:t>hand-written pass: 3.4%</w:t>
+              <w:t>hand-written checks / precision 3.4%</w:t>
             </w:r>
           </w:p>
         </w:tc>
@@ -9075,7 +9075,7 @@
                 <w:i w:val="0"/>
                 <w:sz w:val="14"/>
               </w:rPr>
-              <w:t>primary keys found: 4 of 7</w:t>
+              <w:t>2% dirty · 4 of 7 keys found</w:t>
             </w:r>
           </w:p>
         </w:tc>
@@ -9233,7 +9233,7 @@
                 <w:i w:val="0"/>
                 <w:sz w:val="14"/>
               </w:rPr>
-              <w:t>every profiler tolerance sits near 1%</w:t>
+              <w:t>Every learned limit sits near 1%, so past it the check is never written, and nothing warns.</w:t>
             </w:r>
           </w:p>
         </w:tc>
@@ -9376,7 +9376,7 @@
                 <w:i w:val="0"/>
                 <w:sz w:val="11"/>
               </w:rPr>
-              <w:t>F-62</w:t>
+              <w:t>F-67</w:t>
             </w:r>
           </w:p>
         </w:tc>
@@ -9395,7 +9395,7 @@
                 <w:i w:val="0"/>
                 <w:sz w:val="14"/>
               </w:rPr>
-              <w:t>10%-scale drops</w:t>
+              <w:t>Enforce last month's signed rules / run with --contract / The run loads the signed rules.yml instead of re-learning it, and a test pins this.</w:t>
             </w:r>
           </w:p>
         </w:tc>
@@ -9434,7 +9434,7 @@
                 <w:i w:val="0"/>
                 <w:sz w:val="11"/>
               </w:rPr>
-              <w:t>outputs/stress.json</w:t>
+              <w:t>src/pipeline_builder/orchestrator.py:39-41, :69-90; cli.py:206; tests/test_pipeline.py:125-142</w:t>
             </w:r>
           </w:p>
         </w:tc>
@@ -9453,7 +9453,7 @@
                 <w:i w:val="0"/>
                 <w:sz w:val="14"/>
               </w:rPr>
-              <w:t>scale</w:t>
+              <w:t>RunConfig.contract; discover_state, validate_state; test_frozen_contract_still_catches_defects_on_a_much_dirtier_drop</w:t>
             </w:r>
           </w:p>
         </w:tc>
@@ -9533,7 +9533,7 @@
                 <w:i w:val="0"/>
                 <w:sz w:val="11"/>
               </w:rPr>
-              <w:t>F-63</w:t>
+              <w:t>F-68</w:t>
             </w:r>
           </w:p>
         </w:tc>
@@ -9553,7 +9553,7 @@
                 <w:i w:val="0"/>
                 <w:sz w:val="14"/>
               </w:rPr>
-              <w:t>OPEN SOURCE · MIT</w:t>
+              <w:t>242 · 54 · 42 · 239 · 237 · 238 px</w:t>
             </w:r>
           </w:p>
         </w:tc>
@@ -9573,7 +9573,7 @@
                 <w:i w:val="0"/>
                 <w:sz w:val="14"/>
               </w:rPr>
-              <w:t>10</w:t>
+              <w:t>09</w:t>
             </w:r>
           </w:p>
         </w:tc>
@@ -9594,7 +9594,7 @@
                 <w:i w:val="0"/>
                 <w:sz w:val="11"/>
               </w:rPr>
-              <w:t>LICENSE</w:t>
+              <w:t>demo:compositions/s06-twist.html; outputs/stress.json</w:t>
             </w:r>
           </w:p>
         </w:tc>
@@ -9614,7 +9614,7 @@
                 <w:i w:val="0"/>
                 <w:sz w:val="14"/>
               </w:rPr>
-              <w:t>-</w:t>
+              <w:t>#twist-lb1..3, #twist-rb1..3 widths</w:t>
             </w:r>
           </w:p>
         </w:tc>
@@ -9634,7 +9634,7 @@
                 <w:i w:val="0"/>
                 <w:sz w:val="14"/>
               </w:rPr>
-              <w:t>-</w:t>
+              <w:t>round(recall x 260)</w:t>
             </w:r>
           </w:p>
         </w:tc>
@@ -9654,7 +9654,7 @@
                 <w:i w:val="0"/>
                 <w:sz w:val="14"/>
               </w:rPr>
-              <w:t>direct</w:t>
+              <w:t>derived</w:t>
             </w:r>
           </w:p>
         </w:tc>
@@ -9696,7 +9696,7 @@
                 <w:i w:val="0"/>
                 <w:sz w:val="11"/>
               </w:rPr>
-              <w:t>F-64</w:t>
+              <w:t>F-69</w:t>
             </w:r>
           </w:p>
         </w:tc>
@@ -9715,7 +9715,7 @@
                 <w:i w:val="0"/>
                 <w:sz w:val="14"/>
               </w:rPr>
-              <w:t>dbt · DuckDB · Airflow DAG · pandas · Python</w:t>
+              <w:t>0.5% to 10% of rows carry each defect; rows 0.5% · 2% · 10% dirty</w:t>
             </w:r>
           </w:p>
         </w:tc>
@@ -9734,7 +9734,7 @@
                 <w:i w:val="0"/>
                 <w:sz w:val="14"/>
               </w:rPr>
-              <w:t>10</w:t>
+              <w:t>09</w:t>
             </w:r>
           </w:p>
         </w:tc>
@@ -9754,7 +9754,7 @@
                 <w:i w:val="0"/>
                 <w:sz w:val="11"/>
               </w:rPr>
-              <w:t>pyproject.toml; examples/raw_drop_pipeline.py</w:t>
+              <w:t>outputs/stress.json</w:t>
             </w:r>
           </w:p>
         </w:tc>
@@ -9773,7 +9773,7 @@
                 <w:i w:val="0"/>
                 <w:sz w:val="14"/>
               </w:rPr>
-              <w:t>dependencies; airflow import</w:t>
+              <w:t>sweep keys, frozen_contract keys</w:t>
             </w:r>
           </w:p>
         </w:tc>
@@ -9853,7 +9853,7 @@
                 <w:i w:val="0"/>
                 <w:sz w:val="11"/>
               </w:rPr>
-              <w:t>F-65</w:t>
+              <w:t>F-70</w:t>
             </w:r>
           </w:p>
         </w:tc>
@@ -9873,7 +9873,7 @@
                 <w:i w:val="0"/>
                 <w:sz w:val="14"/>
               </w:rPr>
-              <w:t>$ make e2e   # generate 1.86M rows, build, dbt build, score</w:t>
+              <w:t>make stress reruns the lesson on slide 09</w:t>
             </w:r>
           </w:p>
         </w:tc>
@@ -9934,7 +9934,7 @@
                 <w:i w:val="0"/>
                 <w:sz w:val="14"/>
               </w:rPr>
-              <w:t>e2e: data run</w:t>
+              <w:t>stress: scripts/stress_defect_rate.py</w:t>
             </w:r>
           </w:p>
         </w:tc>
@@ -10016,6 +10016,483 @@
                 <w:i w:val="0"/>
                 <w:sz w:val="11"/>
               </w:rPr>
+              <w:t>F-63</w:t>
+            </w:r>
+          </w:p>
+        </w:tc>
+        <w:tc>
+          <w:tcPr>
+            <w:tcW w:type="dxa" w:w="1474"/>
+          </w:tcPr>
+          <w:p>
+            <w:pPr>
+              <w:spacing w:after="0"/>
+            </w:pPr>
+            <w:r/>
+            <w:r>
+              <w:rPr>
+                <w:b w:val="0"/>
+                <w:i w:val="0"/>
+                <w:sz w:val="14"/>
+              </w:rPr>
+              <w:t>OPEN SOURCE · MIT</w:t>
+            </w:r>
+          </w:p>
+        </w:tc>
+        <w:tc>
+          <w:tcPr>
+            <w:tcW w:type="dxa" w:w="624"/>
+          </w:tcPr>
+          <w:p>
+            <w:pPr>
+              <w:spacing w:after="0"/>
+            </w:pPr>
+            <w:r/>
+            <w:r>
+              <w:rPr>
+                <w:b w:val="0"/>
+                <w:i w:val="0"/>
+                <w:sz w:val="14"/>
+              </w:rPr>
+              <w:t>10</w:t>
+            </w:r>
+          </w:p>
+        </w:tc>
+        <w:tc>
+          <w:tcPr>
+            <w:tcW w:type="dxa" w:w="1701"/>
+          </w:tcPr>
+          <w:p>
+            <w:pPr>
+              <w:spacing w:after="0"/>
+            </w:pPr>
+            <w:r/>
+            <w:r>
+              <w:rPr>
+                <w:rFonts w:ascii="JetBrains Mono" w:hAnsi="JetBrains Mono" w:eastAsia="JetBrains Mono"/>
+                <w:b w:val="0"/>
+                <w:i w:val="0"/>
+                <w:sz w:val="11"/>
+              </w:rPr>
+              <w:t>LICENSE</w:t>
+            </w:r>
+          </w:p>
+        </w:tc>
+        <w:tc>
+          <w:tcPr>
+            <w:tcW w:type="dxa" w:w="1644"/>
+          </w:tcPr>
+          <w:p>
+            <w:pPr>
+              <w:spacing w:after="0"/>
+            </w:pPr>
+            <w:r/>
+            <w:r>
+              <w:rPr>
+                <w:b w:val="0"/>
+                <w:i w:val="0"/>
+                <w:sz w:val="14"/>
+              </w:rPr>
+              <w:t>-</w:t>
+            </w:r>
+          </w:p>
+        </w:tc>
+        <w:tc>
+          <w:tcPr>
+            <w:tcW w:type="dxa" w:w="1644"/>
+          </w:tcPr>
+          <w:p>
+            <w:pPr>
+              <w:spacing w:after="0"/>
+            </w:pPr>
+            <w:r/>
+            <w:r>
+              <w:rPr>
+                <w:b w:val="0"/>
+                <w:i w:val="0"/>
+                <w:sz w:val="14"/>
+              </w:rPr>
+              <w:t>-</w:t>
+            </w:r>
+          </w:p>
+        </w:tc>
+        <w:tc>
+          <w:tcPr>
+            <w:tcW w:type="dxa" w:w="850"/>
+          </w:tcPr>
+          <w:p>
+            <w:pPr>
+              <w:spacing w:after="0"/>
+            </w:pPr>
+            <w:r/>
+            <w:r>
+              <w:rPr>
+                <w:b w:val="0"/>
+                <w:i w:val="0"/>
+                <w:sz w:val="14"/>
+              </w:rPr>
+              <w:t>direct</w:t>
+            </w:r>
+          </w:p>
+        </w:tc>
+        <w:tc>
+          <w:tcPr>
+            <w:tcW w:type="dxa" w:w="1361"/>
+          </w:tcPr>
+          <w:p>
+            <w:pPr>
+              <w:spacing w:after="0"/>
+            </w:pPr>
+            <w:r/>
+            <w:r>
+              <w:rPr>
+                <w:b w:val="0"/>
+                <w:i w:val="0"/>
+                <w:sz w:val="14"/>
+              </w:rPr>
+              <w:t>✓ verified</w:t>
+            </w:r>
+          </w:p>
+        </w:tc>
+      </w:tr>
+      <w:tr>
+        <w:tc>
+          <w:tcPr>
+            <w:tcW w:type="dxa" w:w="567"/>
+            <w:shd w:val="clear" w:color="auto" w:fill="F3F4F6"/>
+          </w:tcPr>
+          <w:p>
+            <w:pPr>
+              <w:spacing w:after="0"/>
+            </w:pPr>
+            <w:r/>
+            <w:r>
+              <w:rPr>
+                <w:rFonts w:ascii="JetBrains Mono" w:hAnsi="JetBrains Mono" w:eastAsia="JetBrains Mono"/>
+                <w:b w:val="0"/>
+                <w:i w:val="0"/>
+                <w:sz w:val="11"/>
+              </w:rPr>
+              <w:t>F-64</w:t>
+            </w:r>
+          </w:p>
+        </w:tc>
+        <w:tc>
+          <w:tcPr>
+            <w:tcW w:type="dxa" w:w="1474"/>
+            <w:shd w:val="clear" w:color="auto" w:fill="F3F4F6"/>
+          </w:tcPr>
+          <w:p>
+            <w:pPr>
+              <w:spacing w:after="0"/>
+            </w:pPr>
+            <w:r/>
+            <w:r>
+              <w:rPr>
+                <w:b w:val="0"/>
+                <w:i w:val="0"/>
+                <w:sz w:val="14"/>
+              </w:rPr>
+              <w:t>dbt · DuckDB · Airflow DAG · pandas · Python</w:t>
+            </w:r>
+          </w:p>
+        </w:tc>
+        <w:tc>
+          <w:tcPr>
+            <w:tcW w:type="dxa" w:w="624"/>
+            <w:shd w:val="clear" w:color="auto" w:fill="F3F4F6"/>
+          </w:tcPr>
+          <w:p>
+            <w:pPr>
+              <w:spacing w:after="0"/>
+            </w:pPr>
+            <w:r/>
+            <w:r>
+              <w:rPr>
+                <w:b w:val="0"/>
+                <w:i w:val="0"/>
+                <w:sz w:val="14"/>
+              </w:rPr>
+              <w:t>10</w:t>
+            </w:r>
+          </w:p>
+        </w:tc>
+        <w:tc>
+          <w:tcPr>
+            <w:tcW w:type="dxa" w:w="1701"/>
+            <w:shd w:val="clear" w:color="auto" w:fill="F3F4F6"/>
+          </w:tcPr>
+          <w:p>
+            <w:pPr>
+              <w:spacing w:after="0"/>
+            </w:pPr>
+            <w:r/>
+            <w:r>
+              <w:rPr>
+                <w:rFonts w:ascii="JetBrains Mono" w:hAnsi="JetBrains Mono" w:eastAsia="JetBrains Mono"/>
+                <w:b w:val="0"/>
+                <w:i w:val="0"/>
+                <w:sz w:val="11"/>
+              </w:rPr>
+              <w:t>pyproject.toml; examples/raw_drop_pipeline.py</w:t>
+            </w:r>
+          </w:p>
+        </w:tc>
+        <w:tc>
+          <w:tcPr>
+            <w:tcW w:type="dxa" w:w="1644"/>
+            <w:shd w:val="clear" w:color="auto" w:fill="F3F4F6"/>
+          </w:tcPr>
+          <w:p>
+            <w:pPr>
+              <w:spacing w:after="0"/>
+            </w:pPr>
+            <w:r/>
+            <w:r>
+              <w:rPr>
+                <w:b w:val="0"/>
+                <w:i w:val="0"/>
+                <w:sz w:val="14"/>
+              </w:rPr>
+              <w:t>dependencies; airflow import</w:t>
+            </w:r>
+          </w:p>
+        </w:tc>
+        <w:tc>
+          <w:tcPr>
+            <w:tcW w:type="dxa" w:w="1644"/>
+            <w:shd w:val="clear" w:color="auto" w:fill="F3F4F6"/>
+          </w:tcPr>
+          <w:p>
+            <w:pPr>
+              <w:spacing w:after="0"/>
+            </w:pPr>
+            <w:r/>
+            <w:r>
+              <w:rPr>
+                <w:b w:val="0"/>
+                <w:i w:val="0"/>
+                <w:sz w:val="14"/>
+              </w:rPr>
+              <w:t>-</w:t>
+            </w:r>
+          </w:p>
+        </w:tc>
+        <w:tc>
+          <w:tcPr>
+            <w:tcW w:type="dxa" w:w="850"/>
+            <w:shd w:val="clear" w:color="auto" w:fill="F3F4F6"/>
+          </w:tcPr>
+          <w:p>
+            <w:pPr>
+              <w:spacing w:after="0"/>
+            </w:pPr>
+            <w:r/>
+            <w:r>
+              <w:rPr>
+                <w:b w:val="0"/>
+                <w:i w:val="0"/>
+                <w:sz w:val="14"/>
+              </w:rPr>
+              <w:t>direct</w:t>
+            </w:r>
+          </w:p>
+        </w:tc>
+        <w:tc>
+          <w:tcPr>
+            <w:tcW w:type="dxa" w:w="1361"/>
+            <w:shd w:val="clear" w:color="auto" w:fill="F3F4F6"/>
+          </w:tcPr>
+          <w:p>
+            <w:pPr>
+              <w:spacing w:after="0"/>
+            </w:pPr>
+            <w:r/>
+            <w:r>
+              <w:rPr>
+                <w:b w:val="0"/>
+                <w:i w:val="0"/>
+                <w:sz w:val="14"/>
+              </w:rPr>
+              <w:t>✓ verified</w:t>
+            </w:r>
+          </w:p>
+        </w:tc>
+      </w:tr>
+      <w:tr>
+        <w:tc>
+          <w:tcPr>
+            <w:tcW w:type="dxa" w:w="567"/>
+          </w:tcPr>
+          <w:p>
+            <w:pPr>
+              <w:spacing w:after="0"/>
+            </w:pPr>
+            <w:r/>
+            <w:r>
+              <w:rPr>
+                <w:rFonts w:ascii="JetBrains Mono" w:hAnsi="JetBrains Mono" w:eastAsia="JetBrains Mono"/>
+                <w:b w:val="0"/>
+                <w:i w:val="0"/>
+                <w:sz w:val="11"/>
+              </w:rPr>
+              <w:t>F-65</w:t>
+            </w:r>
+          </w:p>
+        </w:tc>
+        <w:tc>
+          <w:tcPr>
+            <w:tcW w:type="dxa" w:w="1474"/>
+          </w:tcPr>
+          <w:p>
+            <w:pPr>
+              <w:spacing w:after="0"/>
+            </w:pPr>
+            <w:r/>
+            <w:r>
+              <w:rPr>
+                <w:b w:val="0"/>
+                <w:i w:val="0"/>
+                <w:sz w:val="14"/>
+              </w:rPr>
+              <w:t>$ make e2e   # generate 1.86M rows, build, dbt build, score</w:t>
+            </w:r>
+          </w:p>
+        </w:tc>
+        <w:tc>
+          <w:tcPr>
+            <w:tcW w:type="dxa" w:w="624"/>
+          </w:tcPr>
+          <w:p>
+            <w:pPr>
+              <w:spacing w:after="0"/>
+            </w:pPr>
+            <w:r/>
+            <w:r>
+              <w:rPr>
+                <w:b w:val="0"/>
+                <w:i w:val="0"/>
+                <w:sz w:val="14"/>
+              </w:rPr>
+              <w:t>10</w:t>
+            </w:r>
+          </w:p>
+        </w:tc>
+        <w:tc>
+          <w:tcPr>
+            <w:tcW w:type="dxa" w:w="1701"/>
+          </w:tcPr>
+          <w:p>
+            <w:pPr>
+              <w:spacing w:after="0"/>
+            </w:pPr>
+            <w:r/>
+            <w:r>
+              <w:rPr>
+                <w:rFonts w:ascii="JetBrains Mono" w:hAnsi="JetBrains Mono" w:eastAsia="JetBrains Mono"/>
+                <w:b w:val="0"/>
+                <w:i w:val="0"/>
+                <w:sz w:val="11"/>
+              </w:rPr>
+              <w:t>Makefile</w:t>
+            </w:r>
+          </w:p>
+        </w:tc>
+        <w:tc>
+          <w:tcPr>
+            <w:tcW w:type="dxa" w:w="1644"/>
+          </w:tcPr>
+          <w:p>
+            <w:pPr>
+              <w:spacing w:after="0"/>
+            </w:pPr>
+            <w:r/>
+            <w:r>
+              <w:rPr>
+                <w:b w:val="0"/>
+                <w:i w:val="0"/>
+                <w:sz w:val="14"/>
+              </w:rPr>
+              <w:t>e2e: data run</w:t>
+            </w:r>
+          </w:p>
+        </w:tc>
+        <w:tc>
+          <w:tcPr>
+            <w:tcW w:type="dxa" w:w="1644"/>
+          </w:tcPr>
+          <w:p>
+            <w:pPr>
+              <w:spacing w:after="0"/>
+            </w:pPr>
+            <w:r/>
+            <w:r>
+              <w:rPr>
+                <w:b w:val="0"/>
+                <w:i w:val="0"/>
+                <w:sz w:val="14"/>
+              </w:rPr>
+              <w:t>-</w:t>
+            </w:r>
+          </w:p>
+        </w:tc>
+        <w:tc>
+          <w:tcPr>
+            <w:tcW w:type="dxa" w:w="850"/>
+          </w:tcPr>
+          <w:p>
+            <w:pPr>
+              <w:spacing w:after="0"/>
+            </w:pPr>
+            <w:r/>
+            <w:r>
+              <w:rPr>
+                <w:b w:val="0"/>
+                <w:i w:val="0"/>
+                <w:sz w:val="14"/>
+              </w:rPr>
+              <w:t>direct</w:t>
+            </w:r>
+          </w:p>
+        </w:tc>
+        <w:tc>
+          <w:tcPr>
+            <w:tcW w:type="dxa" w:w="1361"/>
+          </w:tcPr>
+          <w:p>
+            <w:pPr>
+              <w:spacing w:after="0"/>
+            </w:pPr>
+            <w:r/>
+            <w:r>
+              <w:rPr>
+                <w:b w:val="0"/>
+                <w:i w:val="0"/>
+                <w:sz w:val="14"/>
+              </w:rPr>
+              <w:t>✓ verified</w:t>
+            </w:r>
+          </w:p>
+        </w:tc>
+      </w:tr>
+      <w:tr>
+        <w:tc>
+          <w:tcPr>
+            <w:tcW w:type="dxa" w:w="567"/>
+            <w:shd w:val="clear" w:color="auto" w:fill="F3F4F6"/>
+          </w:tcPr>
+          <w:p>
+            <w:pPr>
+              <w:spacing w:after="0"/>
+            </w:pPr>
+            <w:r/>
+            <w:r>
+              <w:rPr>
+                <w:rFonts w:ascii="JetBrains Mono" w:hAnsi="JetBrains Mono" w:eastAsia="JetBrains Mono"/>
+                <w:b w:val="0"/>
+                <w:i w:val="0"/>
+                <w:sz w:val="11"/>
+              </w:rPr>
               <w:t>F-66</w:t>
             </w:r>
           </w:p>
@@ -10023,6 +10500,7 @@
         <w:tc>
           <w:tcPr>
             <w:tcW w:type="dxa" w:w="1474"/>
+            <w:shd w:val="clear" w:color="auto" w:fill="F3F4F6"/>
           </w:tcPr>
           <w:p>
             <w:pPr>
@@ -10042,6 +10520,7 @@
         <w:tc>
           <w:tcPr>
             <w:tcW w:type="dxa" w:w="624"/>
+            <w:shd w:val="clear" w:color="auto" w:fill="F3F4F6"/>
           </w:tcPr>
           <w:p>
             <w:pPr>
@@ -10061,6 +10540,7 @@
         <w:tc>
           <w:tcPr>
             <w:tcW w:type="dxa" w:w="1701"/>
+            <w:shd w:val="clear" w:color="auto" w:fill="F3F4F6"/>
           </w:tcPr>
           <w:p>
             <w:pPr>
@@ -10081,6 +10561,7 @@
         <w:tc>
           <w:tcPr>
             <w:tcW w:type="dxa" w:w="1644"/>
+            <w:shd w:val="clear" w:color="auto" w:fill="F3F4F6"/>
           </w:tcPr>
           <w:p>
             <w:pPr>
@@ -10100,6 +10581,7 @@
         <w:tc>
           <w:tcPr>
             <w:tcW w:type="dxa" w:w="1644"/>
+            <w:shd w:val="clear" w:color="auto" w:fill="F3F4F6"/>
           </w:tcPr>
           <w:p>
             <w:pPr>
@@ -10119,6 +10601,7 @@
         <w:tc>
           <w:tcPr>
             <w:tcW w:type="dxa" w:w="850"/>
+            <w:shd w:val="clear" w:color="auto" w:fill="F3F4F6"/>
           </w:tcPr>
           <w:p>
             <w:pPr>
@@ -10138,6 +10621,7 @@
         <w:tc>
           <w:tcPr>
             <w:tcW w:type="dxa" w:w="1361"/>
+            <w:shd w:val="clear" w:color="auto" w:fill="F3F4F6"/>
           </w:tcPr>
           <w:p>
             <w:pPr>
@@ -10166,7 +10650,7 @@
         <w:pStyle w:val="Heading2"/>
       </w:pPr>
       <w:r>
-        <w:t>2. Automated check run (2026-10-14 14:13)</w:t>
+        <w:t>2. Automated check run (2026-10-14 18:36)</w:t>
       </w:r>
     </w:p>
     <w:tbl>
@@ -14771,7 +15255,7 @@
                 <w:i w:val="0"/>
                 <w:sz w:val="12"/>
               </w:rPr>
-              <w:t>F-62</w:t>
+              <w:t>F-67</w:t>
             </w:r>
           </w:p>
         </w:tc>
@@ -14791,7 +15275,7 @@
                 <w:i w:val="0"/>
                 <w:sz w:val="12"/>
               </w:rPr>
-              <w:t>0.1</w:t>
+              <w:t>true</w:t>
             </w:r>
           </w:p>
         </w:tc>
@@ -14811,7 +15295,7 @@
                 <w:i w:val="0"/>
                 <w:sz w:val="12"/>
               </w:rPr>
-              <w:t>0.1</w:t>
+              <w:t>true</w:t>
             </w:r>
           </w:p>
         </w:tc>
@@ -14853,7 +15337,7 @@
                 <w:i w:val="0"/>
                 <w:sz w:val="12"/>
               </w:rPr>
-              <w:t>F-63</w:t>
+              <w:t>F-68</w:t>
             </w:r>
           </w:p>
         </w:tc>
@@ -14937,7 +15421,7 @@
                 <w:i w:val="0"/>
                 <w:sz w:val="12"/>
               </w:rPr>
-              <w:t>F-64</w:t>
+              <w:t>F-69</w:t>
             </w:r>
           </w:p>
         </w:tc>
@@ -14957,7 +15441,7 @@
                 <w:i w:val="0"/>
                 <w:sz w:val="12"/>
               </w:rPr>
-              <w:t>true</w:t>
+              <w:t>0.5% to 10%</w:t>
             </w:r>
           </w:p>
         </w:tc>
@@ -14977,7 +15461,7 @@
                 <w:i w:val="0"/>
                 <w:sz w:val="12"/>
               </w:rPr>
-              <w:t>true</w:t>
+              <w:t>0.5% to 10%</w:t>
             </w:r>
           </w:p>
         </w:tc>
@@ -15019,7 +15503,7 @@
                 <w:i w:val="0"/>
                 <w:sz w:val="12"/>
               </w:rPr>
-              <w:t>F-65</w:t>
+              <w:t>F-70</w:t>
             </w:r>
           </w:p>
         </w:tc>
@@ -15103,6 +15587,254 @@
                 <w:i w:val="0"/>
                 <w:sz w:val="12"/>
               </w:rPr>
+              <w:t>F-63</w:t>
+            </w:r>
+          </w:p>
+        </w:tc>
+        <w:tc>
+          <w:tcPr>
+            <w:tcW w:type="dxa" w:w="3628"/>
+          </w:tcPr>
+          <w:p>
+            <w:pPr>
+              <w:spacing w:after="0"/>
+            </w:pPr>
+            <w:r/>
+            <w:r>
+              <w:rPr>
+                <w:rFonts w:ascii="JetBrains Mono" w:hAnsi="JetBrains Mono" w:eastAsia="JetBrains Mono"/>
+                <w:b w:val="0"/>
+                <w:i w:val="0"/>
+                <w:sz w:val="12"/>
+              </w:rPr>
+              <w:t>true</w:t>
+            </w:r>
+          </w:p>
+        </w:tc>
+        <w:tc>
+          <w:tcPr>
+            <w:tcW w:type="dxa" w:w="3628"/>
+          </w:tcPr>
+          <w:p>
+            <w:pPr>
+              <w:spacing w:after="0"/>
+            </w:pPr>
+            <w:r/>
+            <w:r>
+              <w:rPr>
+                <w:rFonts w:ascii="JetBrains Mono" w:hAnsi="JetBrains Mono" w:eastAsia="JetBrains Mono"/>
+                <w:b w:val="0"/>
+                <w:i w:val="0"/>
+                <w:sz w:val="12"/>
+              </w:rPr>
+              <w:t>true</w:t>
+            </w:r>
+          </w:p>
+        </w:tc>
+        <w:tc>
+          <w:tcPr>
+            <w:tcW w:type="dxa" w:w="1814"/>
+          </w:tcPr>
+          <w:p>
+            <w:pPr>
+              <w:spacing w:after="0"/>
+            </w:pPr>
+            <w:r/>
+            <w:r>
+              <w:rPr>
+                <w:b w:val="0"/>
+                <w:i w:val="0"/>
+                <w:sz w:val="15"/>
+              </w:rPr>
+              <w:t>✓ pass</w:t>
+            </w:r>
+          </w:p>
+        </w:tc>
+      </w:tr>
+      <w:tr>
+        <w:tc>
+          <w:tcPr>
+            <w:tcW w:type="dxa" w:w="794"/>
+            <w:shd w:val="clear" w:color="auto" w:fill="F3F4F6"/>
+          </w:tcPr>
+          <w:p>
+            <w:pPr>
+              <w:spacing w:after="0"/>
+            </w:pPr>
+            <w:r/>
+            <w:r>
+              <w:rPr>
+                <w:rFonts w:ascii="JetBrains Mono" w:hAnsi="JetBrains Mono" w:eastAsia="JetBrains Mono"/>
+                <w:b w:val="0"/>
+                <w:i w:val="0"/>
+                <w:sz w:val="12"/>
+              </w:rPr>
+              <w:t>F-64</w:t>
+            </w:r>
+          </w:p>
+        </w:tc>
+        <w:tc>
+          <w:tcPr>
+            <w:tcW w:type="dxa" w:w="3628"/>
+            <w:shd w:val="clear" w:color="auto" w:fill="F3F4F6"/>
+          </w:tcPr>
+          <w:p>
+            <w:pPr>
+              <w:spacing w:after="0"/>
+            </w:pPr>
+            <w:r/>
+            <w:r>
+              <w:rPr>
+                <w:rFonts w:ascii="JetBrains Mono" w:hAnsi="JetBrains Mono" w:eastAsia="JetBrains Mono"/>
+                <w:b w:val="0"/>
+                <w:i w:val="0"/>
+                <w:sz w:val="12"/>
+              </w:rPr>
+              <w:t>true</w:t>
+            </w:r>
+          </w:p>
+        </w:tc>
+        <w:tc>
+          <w:tcPr>
+            <w:tcW w:type="dxa" w:w="3628"/>
+            <w:shd w:val="clear" w:color="auto" w:fill="F3F4F6"/>
+          </w:tcPr>
+          <w:p>
+            <w:pPr>
+              <w:spacing w:after="0"/>
+            </w:pPr>
+            <w:r/>
+            <w:r>
+              <w:rPr>
+                <w:rFonts w:ascii="JetBrains Mono" w:hAnsi="JetBrains Mono" w:eastAsia="JetBrains Mono"/>
+                <w:b w:val="0"/>
+                <w:i w:val="0"/>
+                <w:sz w:val="12"/>
+              </w:rPr>
+              <w:t>true</w:t>
+            </w:r>
+          </w:p>
+        </w:tc>
+        <w:tc>
+          <w:tcPr>
+            <w:tcW w:type="dxa" w:w="1814"/>
+            <w:shd w:val="clear" w:color="auto" w:fill="F3F4F6"/>
+          </w:tcPr>
+          <w:p>
+            <w:pPr>
+              <w:spacing w:after="0"/>
+            </w:pPr>
+            <w:r/>
+            <w:r>
+              <w:rPr>
+                <w:b w:val="0"/>
+                <w:i w:val="0"/>
+                <w:sz w:val="15"/>
+              </w:rPr>
+              <w:t>✓ pass</w:t>
+            </w:r>
+          </w:p>
+        </w:tc>
+      </w:tr>
+      <w:tr>
+        <w:tc>
+          <w:tcPr>
+            <w:tcW w:type="dxa" w:w="794"/>
+          </w:tcPr>
+          <w:p>
+            <w:pPr>
+              <w:spacing w:after="0"/>
+            </w:pPr>
+            <w:r/>
+            <w:r>
+              <w:rPr>
+                <w:rFonts w:ascii="JetBrains Mono" w:hAnsi="JetBrains Mono" w:eastAsia="JetBrains Mono"/>
+                <w:b w:val="0"/>
+                <w:i w:val="0"/>
+                <w:sz w:val="12"/>
+              </w:rPr>
+              <w:t>F-65</w:t>
+            </w:r>
+          </w:p>
+        </w:tc>
+        <w:tc>
+          <w:tcPr>
+            <w:tcW w:type="dxa" w:w="3628"/>
+          </w:tcPr>
+          <w:p>
+            <w:pPr>
+              <w:spacing w:after="0"/>
+            </w:pPr>
+            <w:r/>
+            <w:r>
+              <w:rPr>
+                <w:rFonts w:ascii="JetBrains Mono" w:hAnsi="JetBrains Mono" w:eastAsia="JetBrains Mono"/>
+                <w:b w:val="0"/>
+                <w:i w:val="0"/>
+                <w:sz w:val="12"/>
+              </w:rPr>
+              <w:t>true</w:t>
+            </w:r>
+          </w:p>
+        </w:tc>
+        <w:tc>
+          <w:tcPr>
+            <w:tcW w:type="dxa" w:w="3628"/>
+          </w:tcPr>
+          <w:p>
+            <w:pPr>
+              <w:spacing w:after="0"/>
+            </w:pPr>
+            <w:r/>
+            <w:r>
+              <w:rPr>
+                <w:rFonts w:ascii="JetBrains Mono" w:hAnsi="JetBrains Mono" w:eastAsia="JetBrains Mono"/>
+                <w:b w:val="0"/>
+                <w:i w:val="0"/>
+                <w:sz w:val="12"/>
+              </w:rPr>
+              <w:t>true</w:t>
+            </w:r>
+          </w:p>
+        </w:tc>
+        <w:tc>
+          <w:tcPr>
+            <w:tcW w:type="dxa" w:w="1814"/>
+          </w:tcPr>
+          <w:p>
+            <w:pPr>
+              <w:spacing w:after="0"/>
+            </w:pPr>
+            <w:r/>
+            <w:r>
+              <w:rPr>
+                <w:b w:val="0"/>
+                <w:i w:val="0"/>
+                <w:sz w:val="15"/>
+              </w:rPr>
+              <w:t>✓ pass</w:t>
+            </w:r>
+          </w:p>
+        </w:tc>
+      </w:tr>
+      <w:tr>
+        <w:tc>
+          <w:tcPr>
+            <w:tcW w:type="dxa" w:w="794"/>
+            <w:shd w:val="clear" w:color="auto" w:fill="F3F4F6"/>
+          </w:tcPr>
+          <w:p>
+            <w:pPr>
+              <w:spacing w:after="0"/>
+            </w:pPr>
+            <w:r/>
+            <w:r>
+              <w:rPr>
+                <w:rFonts w:ascii="JetBrains Mono" w:hAnsi="JetBrains Mono" w:eastAsia="JetBrains Mono"/>
+                <w:b w:val="0"/>
+                <w:i w:val="0"/>
+                <w:sz w:val="12"/>
+              </w:rPr>
               <w:t>F-66</w:t>
             </w:r>
           </w:p>
@@ -15110,6 +15842,7 @@
         <w:tc>
           <w:tcPr>
             <w:tcW w:type="dxa" w:w="3628"/>
+            <w:shd w:val="clear" w:color="auto" w:fill="F3F4F6"/>
           </w:tcPr>
           <w:p>
             <w:pPr>
@@ -15130,6 +15863,7 @@
         <w:tc>
           <w:tcPr>
             <w:tcW w:type="dxa" w:w="3628"/>
+            <w:shd w:val="clear" w:color="auto" w:fill="F3F4F6"/>
           </w:tcPr>
           <w:p>
             <w:pPr>
@@ -15150,6 +15884,7 @@
         <w:tc>
           <w:tcPr>
             <w:tcW w:type="dxa" w:w="1814"/>
+            <w:shd w:val="clear" w:color="auto" w:fill="F3F4F6"/>
           </w:tcPr>
           <w:p>
             <w:pPr>
@@ -16093,7 +16828,7 @@
                 <w:i w:val="0"/>
                 <w:sz w:val="15"/>
               </w:rPr>
-              <w:t>F-13, F-14, F-15, F-16, F-17, F-58, F-59, F-60, F-62</w:t>
+              <w:t>F-13, F-14, F-15, F-16, F-17, F-58, F-59, F-60, F-68, F-69</w:t>
             </w:r>
           </w:p>
         </w:tc>
@@ -16193,7 +16928,7 @@
                 <w:i w:val="0"/>
                 <w:sz w:val="15"/>
               </w:rPr>
-              <w:t>F-36, F-37, F-38, F-50, F-51, F-52, F-13, F-14, F-15, F-16, F-58, F-59</w:t>
+              <w:t>F-36, F-37, F-38, F-50, F-51, F-52, F-13, F-14, F-15, F-16, F-58, F-59, F-68</w:t>
             </w:r>
           </w:p>
         </w:tc>
@@ -16868,6 +17603,21 @@
           <w:color w:val="4B5563"/>
           <w:sz w:val="18"/>
         </w:rPr>
+        <w:t>Who receives new data sources, and the four problems that slow them down.</w:t>
+      </w:r>
+    </w:p>
+    <w:p>
+      <w:pPr>
+        <w:spacing w:after="20"/>
+        <w:ind w:left="283"/>
+      </w:pPr>
+      <w:r>
+        <w:rPr>
+          <w:b w:val="0"/>
+          <w:i w:val="0"/>
+          <w:color w:val="4B5563"/>
+          <w:sz w:val="18"/>
+        </w:rPr>
         <w:t>WHO LIVES WITH THIS · Retail &amp; e-commerce data teams · Analytics engineers · Data platform &amp; integration</w:t>
       </w:r>
     </w:p>
@@ -17352,7 +18102,7 @@
           <w:i w:val="0"/>
           <w:sz w:val="18"/>
         </w:rPr>
-        <w:t>To change this slide: Edit the chips (#ctx-c1..3) and cards (#ctx-k1..4) in compositions/s01-context.html.</w:t>
+        <w:t>To change this slide: Edit the chips (#ctx-c1..3), cards (#ctx-k1..4) and subtitle (#ctx-sub) in compositions/s01-context.html.</w:t>
       </w:r>
     </w:p>
     <w:p>
@@ -17376,7 +18126,7 @@
           <w:color w:val="4B5563"/>
           <w:sz w:val="18"/>
         </w:rPr>
-        <w:t xml:space="preserve">6.8-11.6 s · composition </w:t>
+        <w:t xml:space="preserve">6.8-12.0 s · composition </w:t>
       </w:r>
       <w:r>
         <w:rPr>
@@ -17467,6 +18217,21 @@
           <w:color w:val="4B5563"/>
           <w:sz w:val="18"/>
         </w:rPr>
+        <w:t>The project in one line: messy files in, a checked and tested data pipeline out.</w:t>
+      </w:r>
+    </w:p>
+    <w:p>
+      <w:pPr>
+        <w:spacing w:after="20"/>
+        <w:ind w:left="283"/>
+      </w:pPr>
+      <w:r>
+        <w:rPr>
+          <w:b w:val="0"/>
+          <w:i w:val="0"/>
+          <w:color w:val="4B5563"/>
+          <w:sz w:val="18"/>
+        </w:rPr>
         <w:t>7 files, 1.86M rows. 45,677 planted defects. Out: a tested dbt pipeline.</w:t>
       </w:r>
     </w:p>
@@ -17483,6 +18248,21 @@
           <w:sz w:val="18"/>
         </w:rPr>
         <w:t>csv · json · jsonl · parquet · two date formats in one column · 9 defect types at known rows</w:t>
+      </w:r>
+    </w:p>
+    <w:p>
+      <w:pPr>
+        <w:spacing w:after="20"/>
+        <w:ind w:left="283"/>
+      </w:pPr>
+      <w:r>
+        <w:rPr>
+          <w:b w:val="0"/>
+          <w:i w:val="0"/>
+          <w:color w:val="4B5563"/>
+          <w:sz w:val="18"/>
+        </w:rPr>
+        <w:t>Planted defect = a bad value added at a known row, so every catch is scored. dbt = tested SQL tables.</w:t>
       </w:r>
     </w:p>
     <w:p>
@@ -18329,7 +19109,7 @@
           <w:i w:val="0"/>
           <w:sz w:val="18"/>
         </w:rPr>
-        <w:t>To change this slide: Headline spans #hook-l1..l3 and chips #hook-f1..f3 in compositions/s02-hook.html; sizes come from make e2e (outputs/metrics.json).</w:t>
+        <w:t>To change this slide: Headline spans #hook-l1..l3, chips #hook-f1..f3 and the definition line #hook-def in compositions/s02-hook.html; sizes come from make e2e (outputs/metrics.json).</w:t>
       </w:r>
     </w:p>
     <w:p>
@@ -18353,7 +19133,7 @@
           <w:color w:val="4B5563"/>
           <w:sz w:val="18"/>
         </w:rPr>
-        <w:t xml:space="preserve">11.3-19.3 s · composition </w:t>
+        <w:t xml:space="preserve">11.7-19.7 s · composition </w:t>
       </w:r>
       <w:r>
         <w:rPr>
@@ -18459,6 +19239,21 @@
           <w:color w:val="4B5563"/>
           <w:sz w:val="18"/>
         </w:rPr>
+        <w:t>Read left to right: learn what the files hold, write checks, stop on bad data, then build the pipeline.</w:t>
+      </w:r>
+    </w:p>
+    <w:p>
+      <w:pPr>
+        <w:spacing w:after="20"/>
+        <w:ind w:left="283"/>
+      </w:pPr>
+      <w:r>
+        <w:rPr>
+          <w:b w:val="0"/>
+          <w:i w:val="0"/>
+          <w:color w:val="4B5563"/>
+          <w:sz w:val="18"/>
+        </w:rPr>
         <w:t>RAW FILES messy CSV, JSON, Parquet → [ONE STATE MACHINE: DISCOVER types, keys, joins → VALIDATE rules + their evidence → GATE too many bad rows? stop → BUILD dbt models + a nightly DAG] → PIPELINE OUT ✓ every type right ✓ bad rows caught ✓ dbt build green</w:t>
       </w:r>
     </w:p>
@@ -19209,7 +20004,7 @@
           <w:i w:val="0"/>
           <w:sz w:val="18"/>
         </w:rPr>
-        <w:t>To change this slide: Edit CONFIG in compositions/explainer.html; badge truth is F-12.</w:t>
+        <w:t>To change this slide: Edit CONFIG and #ex-a-sub in compositions/explainer.html; badge truth is F-12.</w:t>
       </w:r>
     </w:p>
     <w:p>
@@ -19233,7 +20028,7 @@
           <w:color w:val="4B5563"/>
           <w:sz w:val="18"/>
         </w:rPr>
-        <w:t xml:space="preserve">19.3-26.3 s · composition </w:t>
+        <w:t xml:space="preserve">19.7-26.7 s · composition </w:t>
       </w:r>
       <w:r>
         <w:rPr>
@@ -19325,6 +20120,21 @@
           <w:sz w:val="18"/>
         </w:rPr>
         <w:t>The rules become a signed contract</w:t>
+      </w:r>
+    </w:p>
+    <w:p>
+      <w:pPr>
+        <w:spacing w:after="20"/>
+        <w:ind w:left="283"/>
+      </w:pPr>
+      <w:r>
+        <w:rPr>
+          <w:b w:val="0"/>
+          <w:i w:val="0"/>
+          <w:color w:val="4B5563"/>
+          <w:sz w:val="18"/>
+        </w:rPr>
+        <w:t>Each night's files get dirtier. Bars show the share of bad rows caught; longer is better.</w:t>
       </w:r>
     </w:p>
     <w:p>
@@ -19903,7 +20713,7 @@
                 <w:i w:val="0"/>
                 <w:sz w:val="15"/>
               </w:rPr>
-              <w:t>91.3%</w:t>
+              <w:t>91.3% (slide 09 panel and payoff strip)</w:t>
             </w:r>
           </w:p>
         </w:tc>
@@ -20158,7 +20968,7 @@
           <w:color w:val="4B5563"/>
           <w:sz w:val="18"/>
         </w:rPr>
-        <w:t xml:space="preserve">26.0-40.6 s · composition </w:t>
+        <w:t xml:space="preserve">26.4-41.0 s · composition </w:t>
       </w:r>
       <w:r>
         <w:rPr>
@@ -20303,6 +21113,21 @@
           <w:color w:val="4B5563"/>
           <w:sz w:val="18"/>
         </w:rPr>
+        <w:t>Each box is a file in the repo. Data flows left to right; the gate stops the run if over 5% of rows are bad.</w:t>
+      </w:r>
+    </w:p>
+    <w:p>
+      <w:pPr>
+        <w:spacing w:after="20"/>
+        <w:ind w:left="283"/>
+      </w:pPr>
+      <w:r>
+        <w:rPr>
+          <w:b w:val="0"/>
+          <w:i w:val="0"/>
+          <w:color w:val="4B5563"/>
+          <w:sz w:val="18"/>
+        </w:rPr>
         <w:t>orchestrator.py: DISCOVER 39 s → VALIDATE 44 s → BUILD 0.14 s → LAND 6 s → DBT_BUILD 11 s → DONE → run_state.json</w:t>
       </w:r>
     </w:p>
@@ -22329,6 +23154,20 @@
       </w:r>
     </w:p>
     <w:p>
+      <w:pPr>
+        <w:spacing w:after="20"/>
+        <w:ind w:left="283"/>
+      </w:pPr>
+      <w:r>
+        <w:rPr>
+          <w:b w:val="0"/>
+          <w:i w:val="0"/>
+          <w:sz w:val="18"/>
+        </w:rPr>
+        <w:t>• In phase B the off-path boxes dim to 75% opacity (still readable) to spotlight the critical path.</w:t>
+      </w:r>
+    </w:p>
+    <w:p>
       <w:r>
         <w:rPr>
           <w:b w:val="0"/>
@@ -22359,7 +23198,7 @@
           <w:color w:val="4B5563"/>
           <w:sz w:val="18"/>
         </w:rPr>
-        <w:t xml:space="preserve">40.2-54.2 s · composition </w:t>
+        <w:t xml:space="preserve">40.6-54.6 s · composition </w:t>
       </w:r>
       <w:r>
         <w:rPr>
@@ -22504,6 +23343,21 @@
           <w:color w:val="4B5563"/>
           <w:sz w:val="18"/>
         </w:rPr>
+        <w:t>Left: the real run log. Right: share of each table's rows held back; under the 5% line, the run goes on.</w:t>
+      </w:r>
+    </w:p>
+    <w:p>
+      <w:pPr>
+        <w:spacing w:after="20"/>
+        <w:ind w:left="283"/>
+      </w:pPr>
+      <w:r>
+        <w:rPr>
+          <w:b w:val="0"/>
+          <w:i w:val="0"/>
+          <w:color w:val="4B5563"/>
+          <w:sz w:val="18"/>
+        </w:rPr>
         <w:t>$ pipeline-builder run --raw data/raw --out generated · DISCOVER ok 38.67 s 54 columns · 7 keys · 7 joins · VALIDATE ok 44.15 s 136 rules · BUILD ok 0.14 s 39 dbt files · 88-line DAG · LAND ok 5.93 s 7 tables in warehouse.duckdb · DBT_BUILD ok 10.99 s 31 models · 91 pass · 5 warn · DONE raw → green build 99.9 s · 0 tests failed</w:t>
       </w:r>
     </w:p>
@@ -22519,7 +23373,7 @@
           <w:color w:val="4B5563"/>
           <w:sz w:val="18"/>
         </w:rPr>
-        <w:t>QUARANTINE PER TABLE (rows held back by blocking rules): orders 2.86% 11,507 · order_items 2.00% 19,452 · customers 1.99% 1,200 · payments 1.83% 7,409 · returns 0.50% 98 · products 0.00% 0 · stores 0.00% 0 · 5% gate</w:t>
+        <w:t>QUARANTINE PER TABLE (% of rows held back · rows held): orders 2.86% 11,507 · order_items 2.00% 19,452 · customers 1.99% 1,200 · payments 1.83% 7,409 · returns 0.50% 98 · products 0.00% 0 · stores 0.00% 0 · 5% gate</w:t>
       </w:r>
     </w:p>
     <w:p>
@@ -22549,7 +23403,22 @@
           <w:color w:val="4B5563"/>
           <w:sz w:val="18"/>
         </w:rPr>
-        <w:t>Phase 2: Defects caught, by type: seven at 100%, two well short. 45,677 DEFECTS PLANTED AT KNOWN ROWS · 1.86M ROWS · overall recall 88.6% · per-type bars (F-36) with the hand-written first pass as thin grey bars (F-38)</w:t>
+        <w:t>Phase 2: Defects caught, by type: seven at 100%, two well short. Recall = share of planted defects caught; a longer bar is better. One row per kind of defect.</w:t>
+      </w:r>
+    </w:p>
+    <w:p>
+      <w:pPr>
+        <w:spacing w:after="20"/>
+        <w:ind w:left="283"/>
+      </w:pPr>
+      <w:r>
+        <w:rPr>
+          <w:b w:val="0"/>
+          <w:i w:val="0"/>
+          <w:color w:val="4B5563"/>
+          <w:sz w:val="18"/>
+        </w:rPr>
+        <w:t>45,677 DEFECTS PLANTED AT KNOWN ROWS · 1.86M ROWS · overall recall 88.6% · Duplicate row · Missing required value · ID with no match · Text in a number field · Negative amount · Date in the future · Broken email (all 100.0%) · Status or method typo 63.4% · Price inflated 100x 22.8% (F-36); key: validation agent · hand-written checks, for comparison (F-38) · grey number = defects planted</w:t>
       </w:r>
     </w:p>
     <w:p>
@@ -24367,7 +25236,7 @@
                 <w:i w:val="0"/>
                 <w:sz w:val="15"/>
               </w:rPr>
-              <w:t>9 bars</w:t>
+              <w:t>9 bars with plain names</w:t>
             </w:r>
           </w:p>
         </w:tc>
@@ -24388,7 +25257,7 @@
                 <w:i w:val="0"/>
                 <w:sz w:val="12"/>
               </w:rPr>
-              <w:t>outputs/metrics.json</w:t>
+              <w:t>outputs/metrics.json; src/pipeline_builder/datagen.py:515-569</w:t>
             </w:r>
             <w:r>
               <w:rPr>
@@ -24416,7 +25285,7 @@
                 <w:i w:val="0"/>
                 <w:sz w:val="15"/>
               </w:rPr>
-              <w:t>-</w:t>
+              <w:t>on-screen names: duplicate_row = Duplicate row, null_required = Missing required value, orphan_fk = ID with no match, type_corruption = Text in a number field, negative_value = Negative amount, future_date = Date in the future, malformed_email = Broken email, invalid_enum = Status or method typo (orders.status, payments.method), outlier_value = Price inflated 100x (order_items.unit_price x 100)</w:t>
             </w:r>
           </w:p>
         </w:tc>
@@ -24586,7 +25455,7 @@
                 <w:i w:val="0"/>
                 <w:sz w:val="15"/>
               </w:rPr>
-              <w:t>100% for duplicate_row and null_required, 0% for the other seven</w:t>
+              <w:t>100% for Duplicate row and Missing required value, 0% for the other seven</w:t>
             </w:r>
           </w:p>
         </w:tc>
@@ -24811,13 +25680,27 @@
       </w:r>
     </w:p>
     <w:p>
+      <w:pPr>
+        <w:spacing w:after="20"/>
+        <w:ind w:left="283"/>
+      </w:pPr>
       <w:r>
         <w:rPr>
           <w:b w:val="0"/>
           <w:i w:val="0"/>
           <w:sz w:val="18"/>
         </w:rPr>
-        <w:t>To change this slide: LOG, Q and DQ arrays in compositions/s04-routes.html (copied from outputs/metrics.json).</w:t>
+        <w:t>• Defect names are plain-English labels for the generator's defect keys (mapping in F-36).</w:t>
+      </w:r>
+    </w:p>
+    <w:p>
+      <w:r>
+        <w:rPr>
+          <w:b w:val="0"/>
+          <w:i w:val="0"/>
+          <w:sz w:val="18"/>
+        </w:rPr>
+        <w:t>To change this slide: LOG, Q, DQ and PLAIN in compositions/s04-routes.html (numbers copied from outputs/metrics.json).</w:t>
       </w:r>
     </w:p>
     <w:p>
@@ -24841,7 +25724,7 @@
           <w:color w:val="4B5563"/>
           <w:sz w:val="18"/>
         </w:rPr>
-        <w:t xml:space="preserve">53.9-66.9 s · composition </w:t>
+        <w:t xml:space="preserve">54.3-67.3 s · composition </w:t>
       </w:r>
       <w:r>
         <w:rPr>
@@ -24933,6 +25816,21 @@
           <w:sz w:val="18"/>
         </w:rPr>
         <w:t>What the data engineer gets</w:t>
+      </w:r>
+    </w:p>
+    <w:p>
+      <w:pPr>
+        <w:spacing w:after="20"/>
+        <w:ind w:left="283"/>
+      </w:pPr>
+      <w:r>
+        <w:rPr>
+          <w:b w:val="0"/>
+          <w:i w:val="0"/>
+          <w:color w:val="4B5563"/>
+          <w:sz w:val="18"/>
+        </w:rPr>
+        <w:t>Each row is one check on orders.csv, its evidence, and the bad rows it held back. Right: a person signs, then tonight's file runs.</w:t>
       </w:r>
     </w:p>
     <w:p>
@@ -25999,6 +26897,20 @@
       </w:r>
     </w:p>
     <w:p>
+      <w:pPr>
+        <w:spacing w:after="20"/>
+        <w:ind w:left="283"/>
+      </w:pPr>
+      <w:r>
+        <w:rPr>
+          <w:b w:val="0"/>
+          <w:i w:val="0"/>
+          <w:sz w:val="18"/>
+        </w:rPr>
+        <w:t>• Long evidence strings are cut with an ellipsis on screen; the full text is in examples/rules.yml.</w:t>
+      </w:r>
+    </w:p>
+    <w:p>
       <w:r>
         <w:rPr>
           <w:b w:val="0"/>
@@ -26029,7 +26941,7 @@
           <w:color w:val="4B5563"/>
           <w:sz w:val="18"/>
         </w:rPr>
-        <w:t xml:space="preserve">66.6-75.4 s · composition </w:t>
+        <w:t xml:space="preserve">67.0-75.8 s · composition </w:t>
       </w:r>
       <w:r>
         <w:rPr>
@@ -26135,7 +27047,7 @@
           <w:color w:val="4B5563"/>
           <w:sz w:val="18"/>
         </w:rPr>
-        <w:t>DISCOVERY 100% column types inferred right · pandas 68.5% · DuckDB 81.5%</w:t>
+        <w:t>Each score is checked against the answer key of planted defects. Higher is better; the bottom line compares a simpler way.</w:t>
       </w:r>
     </w:p>
     <w:p>
@@ -26150,7 +27062,7 @@
           <w:color w:val="4B5563"/>
           <w:sz w:val="18"/>
         </w:rPr>
-        <w:t>VALIDATION 88.6% planted defects caught · hand-written pass: 29.5%</w:t>
+        <w:t>DISCOVERY 100% column types inferred right · plain pandas read: 68.5% · plain DuckDB read: 81.5%</w:t>
       </w:r>
     </w:p>
     <w:p>
@@ -26165,7 +27077,7 @@
           <w:color w:val="4B5563"/>
           <w:sz w:val="18"/>
         </w:rPr>
-        <w:t>VALIDATION 98.4% of flagged rows are real defects · hand-written pass: 3.4%</w:t>
+        <w:t>VALIDATION 88.6% planted defects caught (recall) · hand-written checks catch 29.5%</w:t>
       </w:r>
     </w:p>
     <w:p>
@@ -26180,7 +27092,22 @@
           <w:color w:val="4B5563"/>
           <w:sz w:val="18"/>
         </w:rPr>
-        <w:t>BUILD + RUN 100 s raw folder to a green dbt build · 31 models · 91 tests pass</w:t>
+        <w:t>VALIDATION 98.4% of flagged rows are real defects (precision) · hand-written checks precision 3.4%</w:t>
+      </w:r>
+    </w:p>
+    <w:p>
+      <w:pPr>
+        <w:spacing w:after="20"/>
+        <w:ind w:left="283"/>
+      </w:pPr>
+      <w:r>
+        <w:rPr>
+          <w:b w:val="0"/>
+          <w:i w:val="0"/>
+          <w:color w:val="4B5563"/>
+          <w:sz w:val="18"/>
+        </w:rPr>
+        <w:t>BUILD + RUN 100 s raw folder to a green dbt build · 31 models built · 91 tests pass</w:t>
       </w:r>
     </w:p>
     <w:p>
@@ -27356,7 +28283,7 @@
                 <w:i w:val="0"/>
                 <w:sz w:val="15"/>
               </w:rPr>
-              <w:t>pandas 68.5% · DuckDB 81.5%</w:t>
+              <w:t>plain pandas read: 68.5% / plain DuckDB read: 81.5%</w:t>
             </w:r>
           </w:p>
         </w:tc>
@@ -27466,7 +28393,7 @@
                 <w:i w:val="0"/>
                 <w:sz w:val="15"/>
               </w:rPr>
-              <w:t>hand-written pass: 29.5%</w:t>
+              <w:t>hand-written checks / catch 29.5%</w:t>
             </w:r>
           </w:p>
         </w:tc>
@@ -27685,7 +28612,7 @@
                 <w:i w:val="0"/>
                 <w:sz w:val="15"/>
               </w:rPr>
-              <w:t>hand-written pass: 3.4%</w:t>
+              <w:t>hand-written checks / precision 3.4%</w:t>
             </w:r>
           </w:p>
         </w:tc>
@@ -27819,7 +28746,7 @@
         <w:pStyle w:val="Heading3"/>
       </w:pPr>
       <w:r>
-        <w:t>Slide 09: What didn't win</w:t>
+        <w:t>Slide 09: Lesson and fix</w:t>
       </w:r>
     </w:p>
     <w:p>
@@ -27830,7 +28757,7 @@
           <w:color w:val="4B5563"/>
           <w:sz w:val="18"/>
         </w:rPr>
-        <w:t xml:space="preserve">75.0-82.0 s · composition </w:t>
+        <w:t xml:space="preserve">75.4-84.4 s · composition </w:t>
       </w:r>
       <w:r>
         <w:rPr>
@@ -27906,7 +28833,7 @@
           <w:color w:val="4B5563"/>
           <w:sz w:val="18"/>
         </w:rPr>
-        <w:t>09 · WHAT DIDN'T WIN</w:t>
+        <w:t>09 · LESSON AND FIX</w:t>
       </w:r>
     </w:p>
     <w:p>
@@ -27921,7 +28848,7 @@
           <w:color w:val="4B5563"/>
           <w:sz w:val="18"/>
         </w:rPr>
-        <w:t>Rules re-learned from a dirty drop fall off a cliff at 2%.</w:t>
+        <w:t>Dirty data teaches bad rules. So I freeze a signed contract.</w:t>
       </w:r>
     </w:p>
     <w:p>
@@ -27936,7 +28863,7 @@
           <w:color w:val="4B5563"/>
           <w:sz w:val="18"/>
         </w:rPr>
-        <w:t>Stress run, 10%-scale drops · share of planted defects caught as the defect rate per type rises</w:t>
+        <w:t>Test drops where 0.5% to 10% of rows carry each defect. Recall = share of defects caught; higher is better.</w:t>
       </w:r>
     </w:p>
     <w:p>
@@ -27951,7 +28878,7 @@
           <w:color w:val="4B5563"/>
           <w:sz w:val="18"/>
         </w:rPr>
-        <w:t>Re-learned · 0.5% (the headline setting) 93.0% · Re-learned · 2% (primary keys found: 4 of 7) 20.8% · Re-learned · 10% 16.3% · Frozen contract · 10% (rules from last month's drop) 91.5%</w:t>
+        <w:t>THE LESSON — Rules re-learned from dirty data miss it. Recall, rules learned again from each drop: 0.5% dirty (near-clean drop) 93.0% · 2% dirty (4 of 7 keys found) 20.8% TRAP · 10% dirty 16.3%</w:t>
       </w:r>
     </w:p>
     <w:p>
@@ -27966,7 +28893,52 @@
           <w:color w:val="4B5563"/>
           <w:sz w:val="18"/>
         </w:rPr>
-        <w:t>Why: every profiler tolerance sits near 1%, so past it the rule is never written. A first run on a dirty source still needs a person to read rules.yml.</w:t>
+        <w:t>Every learned limit sits near 1%, so past it the check is never written, and nothing warns.</w:t>
+      </w:r>
+    </w:p>
+    <w:p>
+      <w:pPr>
+        <w:spacing w:after="20"/>
+        <w:ind w:left="283"/>
+      </w:pPr>
+      <w:r>
+        <w:rPr>
+          <w:b w:val="0"/>
+          <w:i w:val="0"/>
+          <w:color w:val="4B5563"/>
+          <w:sz w:val="18"/>
+        </w:rPr>
+        <w:t>THE FIX, IN THE REPO — Enforce last month's signed rules. Recall, the same drops, run with --contract: 0.5% dirty 92.0% · 2% dirty 91.3% HOLDS · 10% dirty 91.5%</w:t>
+      </w:r>
+    </w:p>
+    <w:p>
+      <w:pPr>
+        <w:spacing w:after="20"/>
+        <w:ind w:left="283"/>
+      </w:pPr>
+      <w:r>
+        <w:rPr>
+          <w:b w:val="0"/>
+          <w:i w:val="0"/>
+          <w:color w:val="4B5563"/>
+          <w:sz w:val="18"/>
+        </w:rPr>
+        <w:t>The run loads the signed rules.yml instead of re-learning it, and a test pins this.</w:t>
+      </w:r>
+    </w:p>
+    <w:p>
+      <w:pPr>
+        <w:spacing w:after="20"/>
+        <w:ind w:left="283"/>
+      </w:pPr>
+      <w:r>
+        <w:rPr>
+          <w:b w:val="0"/>
+          <w:i w:val="0"/>
+          <w:color w:val="4B5563"/>
+          <w:sz w:val="18"/>
+        </w:rPr>
+        <w:t>PAYOFF — At 2% dirty, recall 91.3% with the contract vs 20.8% re-learned · the first contract still needs a review</w:t>
       </w:r>
     </w:p>
     <w:p>
@@ -28342,7 +29314,7 @@
                 <w:i w:val="0"/>
                 <w:sz w:val="12"/>
               </w:rPr>
-              <w:t>F-58</w:t>
+              <w:t>F-15</w:t>
             </w:r>
           </w:p>
         </w:tc>
@@ -28361,7 +29333,7 @@
                 <w:i w:val="0"/>
                 <w:sz w:val="15"/>
               </w:rPr>
-              <w:t>16.3%</w:t>
+              <w:t>92.0%</w:t>
             </w:r>
           </w:p>
         </w:tc>
@@ -28389,7 +29361,7 @@
                 <w:i w:val="0"/>
                 <w:sz w:val="15"/>
               </w:rPr>
-              <w:t xml:space="preserve"> · sweep['0.1'].dq_recall</w:t>
+              <w:t xml:space="preserve"> · frozen_contract['0.005'].dq_recall</w:t>
             </w:r>
           </w:p>
         </w:tc>
@@ -28450,7 +29422,7 @@
                 <w:i w:val="0"/>
                 <w:sz w:val="12"/>
               </w:rPr>
-              <w:t>F-59</w:t>
+              <w:t>F-16</w:t>
             </w:r>
           </w:p>
         </w:tc>
@@ -28470,7 +29442,7 @@
                 <w:i w:val="0"/>
                 <w:sz w:val="15"/>
               </w:rPr>
-              <w:t>91.5%</w:t>
+              <w:t>91.3% (slide 09 panel and payoff strip)</w:t>
             </w:r>
           </w:p>
         </w:tc>
@@ -28499,7 +29471,7 @@
                 <w:i w:val="0"/>
                 <w:sz w:val="15"/>
               </w:rPr>
-              <w:t xml:space="preserve"> · frozen_contract['0.1'].dq_recall</w:t>
+              <w:t xml:space="preserve"> · frozen_contract['0.02'].dq_recall</w:t>
             </w:r>
           </w:p>
         </w:tc>
@@ -28561,7 +29533,7 @@
                 <w:i w:val="0"/>
                 <w:sz w:val="12"/>
               </w:rPr>
-              <w:t>F-60</w:t>
+              <w:t>F-58</w:t>
             </w:r>
           </w:p>
         </w:tc>
@@ -28580,7 +29552,7 @@
                 <w:i w:val="0"/>
                 <w:sz w:val="15"/>
               </w:rPr>
-              <w:t>primary keys found: 4 of 7</w:t>
+              <w:t>16.3%</w:t>
             </w:r>
           </w:p>
         </w:tc>
@@ -28608,7 +29580,7 @@
                 <w:i w:val="0"/>
                 <w:sz w:val="15"/>
               </w:rPr>
-              <w:t xml:space="preserve"> · sweep['0.02'].primary_keys</w:t>
+              <w:t xml:space="preserve"> · sweep['0.1'].dq_recall</w:t>
             </w:r>
           </w:p>
         </w:tc>
@@ -28669,7 +29641,7 @@
                 <w:i w:val="0"/>
                 <w:sz w:val="12"/>
               </w:rPr>
-              <w:t>F-61</w:t>
+              <w:t>F-59</w:t>
             </w:r>
           </w:p>
         </w:tc>
@@ -28689,7 +29661,7 @@
                 <w:i w:val="0"/>
                 <w:sz w:val="15"/>
               </w:rPr>
-              <w:t>every profiler tolerance sits near 1%</w:t>
+              <w:t>91.5%</w:t>
             </w:r>
           </w:p>
         </w:tc>
@@ -28710,15 +29682,15 @@
                 <w:i w:val="0"/>
                 <w:sz w:val="12"/>
               </w:rPr>
-              <w:t>src/pipeline_builder/discovery.py:30-31; validation.py:25, :31</w:t>
-            </w:r>
-            <w:r>
-              <w:rPr>
-                <w:b w:val="0"/>
-                <w:i w:val="0"/>
-                <w:sz w:val="15"/>
-              </w:rPr>
-              <w:t xml:space="preserve"> · KEY_MAX_NULL 0.01, KEY_MIN_DISTINCT 0.99, NOT_NULL_MAX 0.01, NON_NEGATIVE_SHARE 0.99</w:t>
+              <w:t>outputs/stress.json</w:t>
+            </w:r>
+            <w:r>
+              <w:rPr>
+                <w:b w:val="0"/>
+                <w:i w:val="0"/>
+                <w:sz w:val="15"/>
+              </w:rPr>
+              <w:t xml:space="preserve"> · frozen_contract['0.1'].dq_recall</w:t>
             </w:r>
           </w:p>
         </w:tc>
@@ -28780,7 +29752,7 @@
                 <w:i w:val="0"/>
                 <w:sz w:val="12"/>
               </w:rPr>
-              <w:t>F-62</w:t>
+              <w:t>F-60</w:t>
             </w:r>
           </w:p>
         </w:tc>
@@ -28799,7 +29771,7 @@
                 <w:i w:val="0"/>
                 <w:sz w:val="15"/>
               </w:rPr>
-              <w:t>10%-scale drops</w:t>
+              <w:t>2% dirty · 4 of 7 keys found</w:t>
             </w:r>
           </w:p>
         </w:tc>
@@ -28827,7 +29799,445 @@
                 <w:i w:val="0"/>
                 <w:sz w:val="15"/>
               </w:rPr>
-              <w:t xml:space="preserve"> · scale</w:t>
+              <w:t xml:space="preserve"> · sweep['0.02'].primary_keys</w:t>
+            </w:r>
+          </w:p>
+        </w:tc>
+        <w:tc>
+          <w:tcPr>
+            <w:tcW w:type="dxa" w:w="3061"/>
+          </w:tcPr>
+          <w:p>
+            <w:pPr>
+              <w:spacing w:after="0"/>
+            </w:pPr>
+            <w:r/>
+            <w:r>
+              <w:rPr>
+                <w:b w:val="0"/>
+                <w:i w:val="0"/>
+                <w:sz w:val="15"/>
+              </w:rPr>
+              <w:t>-</w:t>
+            </w:r>
+          </w:p>
+        </w:tc>
+        <w:tc>
+          <w:tcPr>
+            <w:tcW w:type="dxa" w:w="850"/>
+          </w:tcPr>
+          <w:p>
+            <w:pPr>
+              <w:spacing w:after="0"/>
+            </w:pPr>
+            <w:r/>
+            <w:r>
+              <w:rPr>
+                <w:b w:val="0"/>
+                <w:i w:val="0"/>
+                <w:sz w:val="15"/>
+              </w:rPr>
+              <w:t>✓</w:t>
+            </w:r>
+          </w:p>
+        </w:tc>
+      </w:tr>
+      <w:tr>
+        <w:tc>
+          <w:tcPr>
+            <w:tcW w:type="dxa" w:w="624"/>
+            <w:shd w:val="clear" w:color="auto" w:fill="F3F4F6"/>
+          </w:tcPr>
+          <w:p>
+            <w:pPr>
+              <w:spacing w:after="0"/>
+            </w:pPr>
+            <w:r/>
+            <w:r>
+              <w:rPr>
+                <w:rFonts w:ascii="JetBrains Mono" w:hAnsi="JetBrains Mono" w:eastAsia="JetBrains Mono"/>
+                <w:b w:val="0"/>
+                <w:i w:val="0"/>
+                <w:sz w:val="12"/>
+              </w:rPr>
+              <w:t>F-61</w:t>
+            </w:r>
+          </w:p>
+        </w:tc>
+        <w:tc>
+          <w:tcPr>
+            <w:tcW w:type="dxa" w:w="1928"/>
+            <w:shd w:val="clear" w:color="auto" w:fill="F3F4F6"/>
+          </w:tcPr>
+          <w:p>
+            <w:pPr>
+              <w:spacing w:after="0"/>
+            </w:pPr>
+            <w:r/>
+            <w:r>
+              <w:rPr>
+                <w:b w:val="0"/>
+                <w:i w:val="0"/>
+                <w:sz w:val="15"/>
+              </w:rPr>
+              <w:t>Every learned limit sits near 1%, so past it the check is never written, and nothing warns.</w:t>
+            </w:r>
+          </w:p>
+        </w:tc>
+        <w:tc>
+          <w:tcPr>
+            <w:tcW w:type="dxa" w:w="3402"/>
+            <w:shd w:val="clear" w:color="auto" w:fill="F3F4F6"/>
+          </w:tcPr>
+          <w:p>
+            <w:pPr>
+              <w:spacing w:after="0"/>
+            </w:pPr>
+            <w:r/>
+            <w:r>
+              <w:rPr>
+                <w:rFonts w:ascii="JetBrains Mono" w:hAnsi="JetBrains Mono" w:eastAsia="JetBrains Mono"/>
+                <w:b w:val="0"/>
+                <w:i w:val="0"/>
+                <w:sz w:val="12"/>
+              </w:rPr>
+              <w:t>src/pipeline_builder/discovery.py:30-31; validation.py:25, :31</w:t>
+            </w:r>
+            <w:r>
+              <w:rPr>
+                <w:b w:val="0"/>
+                <w:i w:val="0"/>
+                <w:sz w:val="15"/>
+              </w:rPr>
+              <w:t xml:space="preserve"> · KEY_MAX_NULL 0.01, KEY_MIN_DISTINCT 0.99, NOT_NULL_MAX 0.01, NON_NEGATIVE_SHARE 0.99</w:t>
+            </w:r>
+          </w:p>
+        </w:tc>
+        <w:tc>
+          <w:tcPr>
+            <w:tcW w:type="dxa" w:w="3061"/>
+            <w:shd w:val="clear" w:color="auto" w:fill="F3F4F6"/>
+          </w:tcPr>
+          <w:p>
+            <w:pPr>
+              <w:spacing w:after="0"/>
+            </w:pPr>
+            <w:r/>
+            <w:r>
+              <w:rPr>
+                <w:b w:val="0"/>
+                <w:i w:val="0"/>
+                <w:sz w:val="15"/>
+              </w:rPr>
+              <w:t>-</w:t>
+            </w:r>
+          </w:p>
+        </w:tc>
+        <w:tc>
+          <w:tcPr>
+            <w:tcW w:type="dxa" w:w="850"/>
+            <w:shd w:val="clear" w:color="auto" w:fill="F3F4F6"/>
+          </w:tcPr>
+          <w:p>
+            <w:pPr>
+              <w:spacing w:after="0"/>
+            </w:pPr>
+            <w:r/>
+            <w:r>
+              <w:rPr>
+                <w:b w:val="0"/>
+                <w:i w:val="0"/>
+                <w:sz w:val="15"/>
+              </w:rPr>
+              <w:t>✓</w:t>
+            </w:r>
+          </w:p>
+        </w:tc>
+      </w:tr>
+      <w:tr>
+        <w:tc>
+          <w:tcPr>
+            <w:tcW w:type="dxa" w:w="624"/>
+          </w:tcPr>
+          <w:p>
+            <w:pPr>
+              <w:spacing w:after="0"/>
+            </w:pPr>
+            <w:r/>
+            <w:r>
+              <w:rPr>
+                <w:rFonts w:ascii="JetBrains Mono" w:hAnsi="JetBrains Mono" w:eastAsia="JetBrains Mono"/>
+                <w:b w:val="0"/>
+                <w:i w:val="0"/>
+                <w:sz w:val="12"/>
+              </w:rPr>
+              <w:t>F-67</w:t>
+            </w:r>
+          </w:p>
+        </w:tc>
+        <w:tc>
+          <w:tcPr>
+            <w:tcW w:type="dxa" w:w="1928"/>
+          </w:tcPr>
+          <w:p>
+            <w:pPr>
+              <w:spacing w:after="0"/>
+            </w:pPr>
+            <w:r/>
+            <w:r>
+              <w:rPr>
+                <w:b w:val="0"/>
+                <w:i w:val="0"/>
+                <w:sz w:val="15"/>
+              </w:rPr>
+              <w:t>Enforce last month's signed rules / run with --contract / The run loads the signed rules.yml instead of re-learning it, and a test pins this.</w:t>
+            </w:r>
+          </w:p>
+        </w:tc>
+        <w:tc>
+          <w:tcPr>
+            <w:tcW w:type="dxa" w:w="3402"/>
+          </w:tcPr>
+          <w:p>
+            <w:pPr>
+              <w:spacing w:after="0"/>
+            </w:pPr>
+            <w:r/>
+            <w:r>
+              <w:rPr>
+                <w:rFonts w:ascii="JetBrains Mono" w:hAnsi="JetBrains Mono" w:eastAsia="JetBrains Mono"/>
+                <w:b w:val="0"/>
+                <w:i w:val="0"/>
+                <w:sz w:val="12"/>
+              </w:rPr>
+              <w:t>src/pipeline_builder/orchestrator.py:39-41, :69-90; cli.py:206; tests/test_pipeline.py:125-142</w:t>
+            </w:r>
+            <w:r>
+              <w:rPr>
+                <w:b w:val="0"/>
+                <w:i w:val="0"/>
+                <w:sz w:val="15"/>
+              </w:rPr>
+              <w:t xml:space="preserve"> · RunConfig.contract; discover_state, validate_state; test_frozen_contract_still_catches_defects_on_a_much_dirtier_drop</w:t>
+            </w:r>
+          </w:p>
+        </w:tc>
+        <w:tc>
+          <w:tcPr>
+            <w:tcW w:type="dxa" w:w="3061"/>
+          </w:tcPr>
+          <w:p>
+            <w:pPr>
+              <w:spacing w:after="0"/>
+            </w:pPr>
+            <w:r/>
+            <w:r>
+              <w:rPr>
+                <w:b w:val="0"/>
+                <w:i w:val="0"/>
+                <w:sz w:val="15"/>
+              </w:rPr>
+              <w:t>-</w:t>
+            </w:r>
+          </w:p>
+        </w:tc>
+        <w:tc>
+          <w:tcPr>
+            <w:tcW w:type="dxa" w:w="850"/>
+          </w:tcPr>
+          <w:p>
+            <w:pPr>
+              <w:spacing w:after="0"/>
+            </w:pPr>
+            <w:r/>
+            <w:r>
+              <w:rPr>
+                <w:b w:val="0"/>
+                <w:i w:val="0"/>
+                <w:sz w:val="15"/>
+              </w:rPr>
+              <w:t>✓</w:t>
+            </w:r>
+          </w:p>
+        </w:tc>
+      </w:tr>
+      <w:tr>
+        <w:tc>
+          <w:tcPr>
+            <w:tcW w:type="dxa" w:w="624"/>
+            <w:shd w:val="clear" w:color="auto" w:fill="F3F4F6"/>
+          </w:tcPr>
+          <w:p>
+            <w:pPr>
+              <w:spacing w:after="0"/>
+            </w:pPr>
+            <w:r/>
+            <w:r>
+              <w:rPr>
+                <w:rFonts w:ascii="JetBrains Mono" w:hAnsi="JetBrains Mono" w:eastAsia="JetBrains Mono"/>
+                <w:b w:val="0"/>
+                <w:i w:val="0"/>
+                <w:sz w:val="12"/>
+              </w:rPr>
+              <w:t>F-68</w:t>
+            </w:r>
+          </w:p>
+        </w:tc>
+        <w:tc>
+          <w:tcPr>
+            <w:tcW w:type="dxa" w:w="1928"/>
+            <w:shd w:val="clear" w:color="auto" w:fill="F3F4F6"/>
+          </w:tcPr>
+          <w:p>
+            <w:pPr>
+              <w:spacing w:after="0"/>
+            </w:pPr>
+            <w:r/>
+            <w:r>
+              <w:rPr>
+                <w:b w:val="0"/>
+                <w:i w:val="0"/>
+                <w:sz w:val="15"/>
+              </w:rPr>
+              <w:t>242 · 54 · 42 · 239 · 237 · 238 px</w:t>
+            </w:r>
+          </w:p>
+        </w:tc>
+        <w:tc>
+          <w:tcPr>
+            <w:tcW w:type="dxa" w:w="3402"/>
+            <w:shd w:val="clear" w:color="auto" w:fill="F3F4F6"/>
+          </w:tcPr>
+          <w:p>
+            <w:pPr>
+              <w:spacing w:after="0"/>
+            </w:pPr>
+            <w:r/>
+            <w:r>
+              <w:rPr>
+                <w:rFonts w:ascii="JetBrains Mono" w:hAnsi="JetBrains Mono" w:eastAsia="JetBrains Mono"/>
+                <w:b w:val="0"/>
+                <w:i w:val="0"/>
+                <w:sz w:val="12"/>
+              </w:rPr>
+              <w:t>demo:compositions/s06-twist.html; outputs/stress.json</w:t>
+            </w:r>
+            <w:r>
+              <w:rPr>
+                <w:b w:val="0"/>
+                <w:i w:val="0"/>
+                <w:sz w:val="15"/>
+              </w:rPr>
+              <w:t xml:space="preserve"> · #twist-lb1..3, #twist-rb1..3 widths</w:t>
+            </w:r>
+          </w:p>
+        </w:tc>
+        <w:tc>
+          <w:tcPr>
+            <w:tcW w:type="dxa" w:w="3061"/>
+            <w:shd w:val="clear" w:color="auto" w:fill="F3F4F6"/>
+          </w:tcPr>
+          <w:p>
+            <w:pPr>
+              <w:spacing w:after="0"/>
+            </w:pPr>
+            <w:r/>
+            <w:r>
+              <w:rPr>
+                <w:b w:val="0"/>
+                <w:i w:val="0"/>
+                <w:sz w:val="15"/>
+              </w:rPr>
+              <w:t>round(recall x 260)</w:t>
+            </w:r>
+          </w:p>
+        </w:tc>
+        <w:tc>
+          <w:tcPr>
+            <w:tcW w:type="dxa" w:w="850"/>
+            <w:shd w:val="clear" w:color="auto" w:fill="F3F4F6"/>
+          </w:tcPr>
+          <w:p>
+            <w:pPr>
+              <w:spacing w:after="0"/>
+            </w:pPr>
+            <w:r/>
+            <w:r>
+              <w:rPr>
+                <w:b w:val="0"/>
+                <w:i w:val="0"/>
+                <w:sz w:val="15"/>
+              </w:rPr>
+              <w:t>✓</w:t>
+            </w:r>
+          </w:p>
+        </w:tc>
+      </w:tr>
+      <w:tr>
+        <w:tc>
+          <w:tcPr>
+            <w:tcW w:type="dxa" w:w="624"/>
+          </w:tcPr>
+          <w:p>
+            <w:pPr>
+              <w:spacing w:after="0"/>
+            </w:pPr>
+            <w:r/>
+            <w:r>
+              <w:rPr>
+                <w:rFonts w:ascii="JetBrains Mono" w:hAnsi="JetBrains Mono" w:eastAsia="JetBrains Mono"/>
+                <w:b w:val="0"/>
+                <w:i w:val="0"/>
+                <w:sz w:val="12"/>
+              </w:rPr>
+              <w:t>F-69</w:t>
+            </w:r>
+          </w:p>
+        </w:tc>
+        <w:tc>
+          <w:tcPr>
+            <w:tcW w:type="dxa" w:w="1928"/>
+          </w:tcPr>
+          <w:p>
+            <w:pPr>
+              <w:spacing w:after="0"/>
+            </w:pPr>
+            <w:r/>
+            <w:r>
+              <w:rPr>
+                <w:b w:val="0"/>
+                <w:i w:val="0"/>
+                <w:sz w:val="15"/>
+              </w:rPr>
+              <w:t>0.5% to 10% of rows carry each defect; rows 0.5% · 2% · 10% dirty</w:t>
+            </w:r>
+          </w:p>
+        </w:tc>
+        <w:tc>
+          <w:tcPr>
+            <w:tcW w:type="dxa" w:w="3402"/>
+          </w:tcPr>
+          <w:p>
+            <w:pPr>
+              <w:spacing w:after="0"/>
+            </w:pPr>
+            <w:r/>
+            <w:r>
+              <w:rPr>
+                <w:rFonts w:ascii="JetBrains Mono" w:hAnsi="JetBrains Mono" w:eastAsia="JetBrains Mono"/>
+                <w:b w:val="0"/>
+                <w:i w:val="0"/>
+                <w:sz w:val="12"/>
+              </w:rPr>
+              <w:t>outputs/stress.json</w:t>
+            </w:r>
+            <w:r>
+              <w:rPr>
+                <w:b w:val="0"/>
+                <w:i w:val="0"/>
+                <w:sz w:val="15"/>
+              </w:rPr>
+              <w:t xml:space="preserve"> · sweep keys, frozen_contract keys</w:t>
             </w:r>
           </w:p>
         </w:tc>
@@ -28910,7 +30320,21 @@
           <w:i w:val="0"/>
           <w:sz w:val="18"/>
         </w:rPr>
-        <w:t>• Bar widths are recall x 1000 px.</w:t>
+        <w:t>• Both panels share one bar scale: 100% recall = 260 px (F-68).</w:t>
+      </w:r>
+    </w:p>
+    <w:p>
+      <w:pPr>
+        <w:spacing w:after="20"/>
+        <w:ind w:left="283"/>
+      </w:pPr>
+      <w:r>
+        <w:rPr>
+          <w:b w:val="0"/>
+          <w:i w:val="0"/>
+          <w:sz w:val="18"/>
+        </w:rPr>
+        <w:t>• Left bars are neutral grey (coral only on the TRAP label and lesson tag); right bars are mint because they are the fix the code implements.</w:t>
       </w:r>
     </w:p>
     <w:p>
@@ -28920,7 +30344,7 @@
           <w:i w:val="0"/>
           <w:sz w:val="18"/>
         </w:rPr>
-        <w:t>To change this slide: Rows #twist-r1..r4 in compositions/s06-twist.html (values from outputs/stress.json).</w:t>
+        <w:t>To change this slide: Rows #twist-l1..l3 / #twist-r1..r3 and the payoff strip in compositions/s06-twist.html (values from outputs/stress.json via make stress).</w:t>
       </w:r>
     </w:p>
     <w:p>
@@ -28944,7 +30368,7 @@
           <w:color w:val="4B5563"/>
           <w:sz w:val="18"/>
         </w:rPr>
-        <w:t xml:space="preserve">81.6-86.0 s · composition </w:t>
+        <w:t xml:space="preserve">84.0-88.4 s · composition </w:t>
       </w:r>
       <w:r>
         <w:rPr>
@@ -29085,6 +30509,21 @@
     </w:p>
     <w:p>
       <w:pPr>
+        <w:spacing w:after="20"/>
+        <w:ind w:left="283"/>
+      </w:pPr>
+      <w:r>
+        <w:rPr>
+          <w:b w:val="0"/>
+          <w:i w:val="0"/>
+          <w:color w:val="4B5563"/>
+          <w:sz w:val="18"/>
+        </w:rPr>
+        <w:t>One command rebuilds the main results; make stress reruns the lesson on slide 09.</w:t>
+      </w:r>
+    </w:p>
+    <w:p>
+      <w:pPr>
         <w:spacing w:after="40"/>
       </w:pPr>
       <w:r>
@@ -29237,7 +30676,7 @@
                 <w:i w:val="0"/>
                 <w:sz w:val="12"/>
               </w:rPr>
-              <w:t>F-63</w:t>
+              <w:t>F-70</w:t>
             </w:r>
           </w:p>
         </w:tc>
@@ -29256,7 +30695,7 @@
                 <w:i w:val="0"/>
                 <w:sz w:val="15"/>
               </w:rPr>
-              <w:t>OPEN SOURCE · MIT</w:t>
+              <w:t>make stress reruns the lesson on slide 09</w:t>
             </w:r>
           </w:p>
         </w:tc>
@@ -29276,15 +30715,15 @@
                 <w:i w:val="0"/>
                 <w:sz w:val="12"/>
               </w:rPr>
-              <w:t>LICENSE</w:t>
-            </w:r>
-            <w:r>
-              <w:rPr>
-                <w:b w:val="0"/>
-                <w:i w:val="0"/>
-                <w:sz w:val="15"/>
-              </w:rPr>
-              <w:t xml:space="preserve"> · -</w:t>
+              <w:t>Makefile</w:t>
+            </w:r>
+            <w:r>
+              <w:rPr>
+                <w:b w:val="0"/>
+                <w:i w:val="0"/>
+                <w:sz w:val="15"/>
+              </w:rPr>
+              <w:t xml:space="preserve"> · stress: scripts/stress_defect_rate.py</w:t>
             </w:r>
           </w:p>
         </w:tc>
@@ -29345,7 +30784,7 @@
                 <w:i w:val="0"/>
                 <w:sz w:val="12"/>
               </w:rPr>
-              <w:t>F-64</w:t>
+              <w:t>F-63</w:t>
             </w:r>
           </w:p>
         </w:tc>
@@ -29365,7 +30804,7 @@
                 <w:i w:val="0"/>
                 <w:sz w:val="15"/>
               </w:rPr>
-              <w:t>dbt · DuckDB · Airflow DAG · pandas · Python</w:t>
+              <w:t>OPEN SOURCE · MIT</w:t>
             </w:r>
           </w:p>
         </w:tc>
@@ -29386,15 +30825,15 @@
                 <w:i w:val="0"/>
                 <w:sz w:val="12"/>
               </w:rPr>
-              <w:t>pyproject.toml; examples/raw_drop_pipeline.py</w:t>
-            </w:r>
-            <w:r>
-              <w:rPr>
-                <w:b w:val="0"/>
-                <w:i w:val="0"/>
-                <w:sz w:val="15"/>
-              </w:rPr>
-              <w:t xml:space="preserve"> · dependencies; airflow import</w:t>
+              <w:t>LICENSE</w:t>
+            </w:r>
+            <w:r>
+              <w:rPr>
+                <w:b w:val="0"/>
+                <w:i w:val="0"/>
+                <w:sz w:val="15"/>
+              </w:rPr>
+              <w:t xml:space="preserve"> · -</w:t>
             </w:r>
           </w:p>
         </w:tc>
@@ -29456,7 +30895,7 @@
                 <w:i w:val="0"/>
                 <w:sz w:val="12"/>
               </w:rPr>
-              <w:t>F-65</w:t>
+              <w:t>F-64</w:t>
             </w:r>
           </w:p>
         </w:tc>
@@ -29475,7 +30914,7 @@
                 <w:i w:val="0"/>
                 <w:sz w:val="15"/>
               </w:rPr>
-              <w:t>$ make e2e   # generate 1.86M rows, build, dbt build, score</w:t>
+              <w:t>dbt · DuckDB · Airflow DAG · pandas · Python</w:t>
             </w:r>
           </w:p>
         </w:tc>
@@ -29495,15 +30934,15 @@
                 <w:i w:val="0"/>
                 <w:sz w:val="12"/>
               </w:rPr>
-              <w:t>Makefile</w:t>
-            </w:r>
-            <w:r>
-              <w:rPr>
-                <w:b w:val="0"/>
-                <w:i w:val="0"/>
-                <w:sz w:val="15"/>
-              </w:rPr>
-              <w:t xml:space="preserve"> · e2e: data run</w:t>
+              <w:t>pyproject.toml; examples/raw_drop_pipeline.py</w:t>
+            </w:r>
+            <w:r>
+              <w:rPr>
+                <w:b w:val="0"/>
+                <w:i w:val="0"/>
+                <w:sz w:val="15"/>
+              </w:rPr>
+              <w:t xml:space="preserve"> · dependencies; airflow import</w:t>
             </w:r>
           </w:p>
         </w:tc>
@@ -29564,6 +31003,117 @@
                 <w:i w:val="0"/>
                 <w:sz w:val="12"/>
               </w:rPr>
+              <w:t>F-65</w:t>
+            </w:r>
+          </w:p>
+        </w:tc>
+        <w:tc>
+          <w:tcPr>
+            <w:tcW w:type="dxa" w:w="1928"/>
+            <w:shd w:val="clear" w:color="auto" w:fill="F3F4F6"/>
+          </w:tcPr>
+          <w:p>
+            <w:pPr>
+              <w:spacing w:after="0"/>
+            </w:pPr>
+            <w:r/>
+            <w:r>
+              <w:rPr>
+                <w:b w:val="0"/>
+                <w:i w:val="0"/>
+                <w:sz w:val="15"/>
+              </w:rPr>
+              <w:t>$ make e2e   # generate 1.86M rows, build, dbt build, score</w:t>
+            </w:r>
+          </w:p>
+        </w:tc>
+        <w:tc>
+          <w:tcPr>
+            <w:tcW w:type="dxa" w:w="3402"/>
+            <w:shd w:val="clear" w:color="auto" w:fill="F3F4F6"/>
+          </w:tcPr>
+          <w:p>
+            <w:pPr>
+              <w:spacing w:after="0"/>
+            </w:pPr>
+            <w:r/>
+            <w:r>
+              <w:rPr>
+                <w:rFonts w:ascii="JetBrains Mono" w:hAnsi="JetBrains Mono" w:eastAsia="JetBrains Mono"/>
+                <w:b w:val="0"/>
+                <w:i w:val="0"/>
+                <w:sz w:val="12"/>
+              </w:rPr>
+              <w:t>Makefile</w:t>
+            </w:r>
+            <w:r>
+              <w:rPr>
+                <w:b w:val="0"/>
+                <w:i w:val="0"/>
+                <w:sz w:val="15"/>
+              </w:rPr>
+              <w:t xml:space="preserve"> · e2e: data run</w:t>
+            </w:r>
+          </w:p>
+        </w:tc>
+        <w:tc>
+          <w:tcPr>
+            <w:tcW w:type="dxa" w:w="3061"/>
+            <w:shd w:val="clear" w:color="auto" w:fill="F3F4F6"/>
+          </w:tcPr>
+          <w:p>
+            <w:pPr>
+              <w:spacing w:after="0"/>
+            </w:pPr>
+            <w:r/>
+            <w:r>
+              <w:rPr>
+                <w:b w:val="0"/>
+                <w:i w:val="0"/>
+                <w:sz w:val="15"/>
+              </w:rPr>
+              <w:t>-</w:t>
+            </w:r>
+          </w:p>
+        </w:tc>
+        <w:tc>
+          <w:tcPr>
+            <w:tcW w:type="dxa" w:w="850"/>
+            <w:shd w:val="clear" w:color="auto" w:fill="F3F4F6"/>
+          </w:tcPr>
+          <w:p>
+            <w:pPr>
+              <w:spacing w:after="0"/>
+            </w:pPr>
+            <w:r/>
+            <w:r>
+              <w:rPr>
+                <w:b w:val="0"/>
+                <w:i w:val="0"/>
+                <w:sz w:val="15"/>
+              </w:rPr>
+              <w:t>✓</w:t>
+            </w:r>
+          </w:p>
+        </w:tc>
+      </w:tr>
+      <w:tr>
+        <w:tc>
+          <w:tcPr>
+            <w:tcW w:type="dxa" w:w="624"/>
+          </w:tcPr>
+          <w:p>
+            <w:pPr>
+              <w:spacing w:after="0"/>
+            </w:pPr>
+            <w:r/>
+            <w:r>
+              <w:rPr>
+                <w:rFonts w:ascii="JetBrains Mono" w:hAnsi="JetBrains Mono" w:eastAsia="JetBrains Mono"/>
+                <w:b w:val="0"/>
+                <w:i w:val="0"/>
+                <w:sz w:val="12"/>
+              </w:rPr>
               <w:t>F-66</w:t>
             </w:r>
           </w:p>
@@ -29571,7 +31121,6 @@
         <w:tc>
           <w:tcPr>
             <w:tcW w:type="dxa" w:w="1928"/>
-            <w:shd w:val="clear" w:color="auto" w:fill="F3F4F6"/>
           </w:tcPr>
           <w:p>
             <w:pPr>
@@ -29591,7 +31140,6 @@
         <w:tc>
           <w:tcPr>
             <w:tcW w:type="dxa" w:w="3402"/>
-            <w:shd w:val="clear" w:color="auto" w:fill="F3F4F6"/>
           </w:tcPr>
           <w:p>
             <w:pPr>
@@ -29620,7 +31168,6 @@
         <w:tc>
           <w:tcPr>
             <w:tcW w:type="dxa" w:w="3061"/>
-            <w:shd w:val="clear" w:color="auto" w:fill="F3F4F6"/>
           </w:tcPr>
           <w:p>
             <w:pPr>
@@ -29640,7 +31187,6 @@
         <w:tc>
           <w:tcPr>
             <w:tcW w:type="dxa" w:w="850"/>
-            <w:shd w:val="clear" w:color="auto" w:fill="F3F4F6"/>
           </w:tcPr>
           <w:p>
             <w:pPr>
@@ -30587,7 +32133,7 @@
                 <w:i w:val="0"/>
                 <w:sz w:val="15"/>
               </w:rPr>
-              <w:t>F-13, F-14, F-15, F-16, F-17, F-58, F-59, F-60, F-62</w:t>
+              <w:t>F-13, F-14, F-15, F-16, F-17, F-58, F-59, F-60, F-68, F-69</w:t>
             </w:r>
           </w:p>
         </w:tc>
@@ -30688,7 +32234,7 @@
                 <w:i w:val="0"/>
                 <w:sz w:val="15"/>
               </w:rPr>
-              <w:t>F-36, F-37, F-38, F-50, F-51, F-52, F-13, F-14, F-15, F-16, F-58, F-59</w:t>
+              <w:t>F-36, F-37, F-38, F-50, F-51, F-52, F-13, F-14, F-15, F-16, F-58, F-59, F-68</w:t>
             </w:r>
           </w:p>
         </w:tc>
@@ -31352,6 +32898,34 @@
           <w:sz w:val="19"/>
         </w:rPr>
         <w:t>• Slide 07's review step is shown, not measured: the counts on the sheet are from the draft rules, before any edit.</w:t>
+      </w:r>
+    </w:p>
+    <w:p>
+      <w:pPr>
+        <w:spacing w:after="40"/>
+        <w:ind w:left="227"/>
+      </w:pPr>
+      <w:r>
+        <w:rPr>
+          <w:b w:val="0"/>
+          <w:i w:val="0"/>
+          <w:sz w:val="19"/>
+        </w:rPr>
+        <w:t>• Slide 09 shows the stress sweep at 0.5%, 2% and 10%; the 5% row (re-learned 16.3%, frozen 91.6%) and the format-shift arm (type accuracy 94.4%, no warning) are dropped from the slide and still reported in outputs/stress.md and the README section 'The run that embarrasses the headline'.</w:t>
+      </w:r>
+    </w:p>
+    <w:p>
+      <w:pPr>
+        <w:spacing w:after="40"/>
+        <w:ind w:left="227"/>
+      </w:pPr>
+      <w:r>
+        <w:rPr>
+          <w:b w:val="0"/>
+          <w:i w:val="0"/>
+          <w:sz w:val="19"/>
+        </w:rPr>
+        <w:t>• On slide 09 the near-clean 0.5% drop scores slightly higher with re-learned rules (93.0%) than with the frozen contract (92.0%); both are shown. The fix is not free: the first contract still needs a person to read rules.yml (README 'Known limitations').</w:t>
       </w:r>
     </w:p>
     <w:p>

</xml_diff>